<commit_message>
Both phone numbers on the master, the unsent seats and their emails; IC seats titled Principal Software Architect
Co-Authored-By: Claude Opus 5.5 <noreply@anthropic.com>
</commit_message>
<xml_diff>
--- a/September-2026/30/recruise-ai-architect-healthcare/Abhisheik_Deo_Resume.docx
+++ b/September-2026/30/recruise-ai-architect-healthcare/Abhisheik_Deo_Resume.docx
@@ -35,7 +35,7 @@
           <w:color w:val="328EF7"/>
           <w:sz w:val="18"/>
         </w:rPr>
-        <w:t xml:space="preserve"> · +91 93640 27487</w:t>
+        <w:t xml:space="preserve"> · +91 93640 27487 / +91 97049 68861</w:t>
       </w:r>
       <w:hyperlink r:id="rId9">
         <w:r>
@@ -637,7 +637,7 @@
         <w:rPr>
           <w:b/>
         </w:rPr>
-        <w:t>Vice President of Technology</w:t>
+        <w:t>Principal Software Architect</w:t>
       </w:r>
       <w:r>
         <w:tab/>

</xml_diff>